<commit_message>
Wykaz działki: linijka odstępu nad podpisem i dane bez pogrubienia
Dwie poprawki po obejrzeniu wydruku:

Podpis przyklejony do dolnej krawędzi tabeli wyglądał jak jej dalszy ciąg —
wchodzi jeden pusty akapit. Stos akapitów, który wcześniej spychał podpis na
osobną kartkę, nie wraca: jest dokładnie jeden i pilnuje tego test.

Dane w tabeli były pogrubione, a w wykazie budynku nie są. Wytłuszczony zostaje
sam nagłówek, tak jak tam.

Co-Authored-By: Claude Opus 5 <noreply@anthropic.com>
</commit_message>
<xml_diff>
--- a/szablony/wykaz_zmian_dzialki_wzor.docx
+++ b/szablony/wykaz_zmian_dzialki_wzor.docx
@@ -2115,7 +2115,6 @@
             <w:r>
               <w:rPr>
                 <w:rFonts w:cs="Calibri" w:ascii="Calibri" w:hAnsi="Calibri"/>
-                <w:b/>
                 <w:kern w:val="0"/>
                 <w:sz w:val="16"/>
                 <w:szCs w:val="16"/>
@@ -2154,7 +2153,6 @@
             <w:r>
               <w:rPr>
                 <w:rFonts w:cs="Calibri" w:ascii="Calibri" w:hAnsi="Calibri"/>
-                <w:b/>
                 <w:kern w:val="0"/>
                 <w:sz w:val="16"/>
                 <w:szCs w:val="16"/>
@@ -2193,7 +2191,6 @@
             <w:r>
               <w:rPr>
                 <w:rFonts w:cs="Calibri" w:ascii="Calibri" w:hAnsi="Calibri"/>
-                <w:b/>
                 <w:kern w:val="0"/>
                 <w:sz w:val="16"/>
                 <w:szCs w:val="16"/>
@@ -2232,7 +2229,6 @@
             <w:r>
               <w:rPr>
                 <w:rFonts w:cs="Calibri" w:ascii="Calibri" w:hAnsi="Calibri"/>
-                <w:b/>
                 <w:kern w:val="0"/>
                 <w:sz w:val="16"/>
                 <w:szCs w:val="16"/>
@@ -2287,7 +2283,6 @@
             <w:r>
               <w:rPr>
                 <w:rFonts w:cs="Calibri" w:ascii="Calibri" w:hAnsi="Calibri"/>
-                <w:b/>
                 <w:kern w:val="0"/>
                 <w:sz w:val="16"/>
                 <w:szCs w:val="16"/>
@@ -2326,7 +2321,6 @@
             <w:r>
               <w:rPr>
                 <w:rFonts w:cs="Calibri" w:ascii="Calibri" w:hAnsi="Calibri"/>
-                <w:b/>
                 <w:kern w:val="0"/>
                 <w:sz w:val="16"/>
                 <w:szCs w:val="16"/>
@@ -2365,7 +2359,6 @@
             <w:r>
               <w:rPr>
                 <w:rFonts w:cs="Calibri" w:ascii="Calibri" w:hAnsi="Calibri"/>
-                <w:b/>
                 <w:kern w:val="0"/>
                 <w:sz w:val="16"/>
                 <w:szCs w:val="16"/>
@@ -2420,7 +2413,6 @@
             <w:r>
               <w:rPr>
                 <w:rFonts w:cs="Calibri" w:ascii="Calibri" w:hAnsi="Calibri"/>
-                <w:b/>
                 <w:kern w:val="0"/>
                 <w:sz w:val="16"/>
                 <w:szCs w:val="16"/>
@@ -2459,7 +2451,6 @@
             <w:r>
               <w:rPr>
                 <w:rFonts w:cs="Calibri" w:ascii="Calibri" w:hAnsi="Calibri"/>
-                <w:b/>
                 <w:kern w:val="0"/>
                 <w:sz w:val="16"/>
                 <w:szCs w:val="16"/>
@@ -2499,7 +2490,6 @@
             <w:r>
               <w:rPr>
                 <w:rFonts w:cs="Calibri" w:ascii="Calibri" w:hAnsi="Calibri"/>
-                <w:b/>
                 <w:kern w:val="0"/>
                 <w:sz w:val="16"/>
                 <w:szCs w:val="16"/>
@@ -2539,7 +2529,6 @@
             <w:r>
               <w:rPr>
                 <w:rFonts w:cs="Calibri" w:ascii="Calibri" w:hAnsi="Calibri"/>
-                <w:b/>
                 <w:kern w:val="0"/>
                 <w:sz w:val="16"/>
                 <w:szCs w:val="16"/>
@@ -2578,7 +2567,6 @@
             <w:r>
               <w:rPr>
                 <w:rFonts w:cs="Calibri" w:ascii="Calibri" w:hAnsi="Calibri"/>
-                <w:b/>
                 <w:kern w:val="0"/>
                 <w:sz w:val="16"/>
                 <w:szCs w:val="16"/>
@@ -2618,7 +2606,6 @@
             <w:r>
               <w:rPr>
                 <w:rFonts w:cs="Calibri" w:ascii="Calibri" w:hAnsi="Calibri"/>
-                <w:b/>
                 <w:kern w:val="0"/>
                 <w:sz w:val="16"/>
                 <w:szCs w:val="16"/>
@@ -3046,6 +3033,22 @@
         </w:tc>
       </w:tr>
     </w:tbl>
+    <w:p>
+      <w:pPr>
+        <w:suppressAutoHyphens/>
+        <w:jc w:val="center"/>
+        <w:rPr>
+          <w:rFonts w:ascii="Bahnschrift SemiBold" w:hAnsi="Bahnschrift SemiBold" w:cs="Calibri"/>
+          <w:b/>
+          <w:bCs/>
+          <w:kern w:val="0"/>
+          <w:sz w:val="24"/>
+          <w:szCs w:val="24"/>
+          <w:u w:val="single"/>
+          <w:lang w:eastAsia="zh-CN"/>
+        </w:rPr>
+      </w:pPr>
+    </w:p>
     <w:p>
       <w:pPr>
         <w:tabs>

</xml_diff>

<commit_message>
Numer działki w nagłówku odzyskał pogrubienie
Wiersz „Identyfikator działki ewidencyjnej” wychodził bez wytłuszczenia, choć trzy
wiersze nad nim mają wartość pogrubioną. Etykieta i wartość siedzą w formatce
w **osobnych biegach** i różnią się formatowaniem, a pierwsza wersja skryptu sklejała
je w jeden bieg — ten od etykiety, czyli zwykły.

Teraz klon wiersza nagłówka podmienia tekst osobno w biegu przed tabulatorem i osobno
w pierwszym po nim, resztę biegów kasując. Test sprawdza jedno i drugie: wartość
pogrubiona, etykieta zwykła.

Co-Authored-By: Claude Opus 5 <noreply@anthropic.com>
</commit_message>
<xml_diff>
--- a/szablony/wykaz_zmian_dzialki_wzor.docx
+++ b/szablony/wykaz_zmian_dzialki_wzor.docx
@@ -550,12 +550,30 @@
           <w:u w:val="none"/>
           <w:lang w:eastAsia="zh-CN"/>
         </w:rPr>
-        <w:t xml:space="preserve">Identyfikator działki ewidencyjnej:	[{{ polozenie_obreb_teryt }}.{{ dzialka.dzialka }}]</w:t>
-      </w:r>
-      <w:proofErr w:type="spellStart"/>
-      <w:proofErr w:type="spellEnd"/>
-      <w:proofErr w:type="spellStart"/>
-      <w:proofErr w:type="spellEnd"/>
+        <w:t xml:space="preserve">Identyfikator działki ewidencyjnej:</w:t>
+      </w:r>
+      <w:r>
+        <w:rPr>
+          <w:rFonts w:cs="Tahoma" w:ascii="Calibri" w:hAnsi="Calibri"/>
+          <w:kern w:val="0"/>
+          <w:sz w:val="20"/>
+          <w:u w:val="none"/>
+          <w:lang w:eastAsia="zh-CN"/>
+        </w:rPr>
+        <w:tab/>
+      </w:r>
+      <w:r>
+        <w:rPr>
+          <w:rFonts w:cs="Tahoma" w:ascii="Calibri" w:hAnsi="Calibri"/>
+          <w:b/>
+          <w:bCs/>
+          <w:kern w:val="0"/>
+          <w:sz w:val="20"/>
+          <w:u w:val="none"/>
+          <w:lang w:eastAsia="zh-CN"/>
+        </w:rPr>
+        <w:t xml:space="preserve">[{{ polozenie_obreb_teryt }}.{{ dzialka.dzialka }}]</w:t>
+      </w:r>
     </w:p>
     <w:p>
       <w:pPr>

</xml_diff>

<commit_message>
Tabela wykazu działki domknięta z prawej, PPU z jednostką
Na wydruku nagłówek „STAN NOWY” został bez prawego boku: komórki klonujemy z formatki
budynku, a tam prawą krawędź ma wyłącznie ostatnia kolumna — użyta jako wzorzec w środku
wiersza dokładała kreskę tam, gdzie jej nie trzeba, a na końcu wiersza nie domykała
tabeli. Teraz po zbudowaniu każdego wiersza prawa kreska ląduje na ostatniej komórce
i tylko na niej. Test przechodzi po wszystkich wierszach, bo w tabeli z dwoma piętrami
nagłówka i scaleniami łatwo o taką dziurę w jednym miejscu.

Nagłówek PPU dostał jednostkę — „PPU [ha]”. To jedyna z czterech kolumn użytków,
w której stoją liczby; reszta to oznaczenia użytków i klas.

Co-Authored-By: Claude Opus 5 <noreply@anthropic.com>
</commit_message>
<xml_diff>
--- a/szablony/wykaz_zmian_dzialki_wzor.docx
+++ b/szablony/wykaz_zmian_dzialki_wzor.docx
@@ -786,6 +786,7 @@
               <w:top w:val="single" w:sz="4" w:space="0" w:color="000000"/>
               <w:left w:val="single" w:sz="4" w:space="0" w:color="000000"/>
               <w:bottom w:val="single" w:sz="4" w:space="0" w:color="000000"/>
+              <w:right w:val="single" w:sz="4" w:space="0" w:color="000000"/>
             </w:tcBorders>
             <w:vAlign w:val="center"/>
           </w:tcPr>
@@ -1007,7 +1008,7 @@
                 <w:sz w:val="14"/>
                 <w:lang w:eastAsia="zh-CN"/>
               </w:rPr>
-              <w:t xml:space="preserve">PPU</w:t>
+              <w:t xml:space="preserve">PPU [ha]</w:t>
             </w:r>
           </w:p>
         </w:tc>
@@ -1123,6 +1124,7 @@
               <w:top w:val="single" w:sz="4" w:space="0" w:color="000000"/>
               <w:left w:val="single" w:sz="4" w:space="0" w:color="000000"/>
               <w:bottom w:val="single" w:sz="4" w:space="0" w:color="000000"/>
+              <w:right w:val="single" w:sz="4" w:space="0" w:color="000000"/>
             </w:tcBorders>
             <w:vAlign w:val="center"/>
           </w:tcPr>
@@ -1147,7 +1149,7 @@
                 <w:sz w:val="14"/>
                 <w:lang w:eastAsia="zh-CN"/>
               </w:rPr>
-              <w:t xml:space="preserve">PPU</w:t>
+              <w:t xml:space="preserve">PPU [ha]</w:t>
             </w:r>
           </w:p>
         </w:tc>
@@ -1235,7 +1237,6 @@
               <w:top w:val="single" w:sz="4" w:space="0" w:color="000000"/>
               <w:left w:val="single" w:sz="4" w:space="0" w:color="000000"/>
               <w:bottom w:val="single" w:sz="4" w:space="0" w:color="000000"/>
-              <w:right w:val="single" w:sz="4" w:space="0" w:color="000000"/>
             </w:tcBorders>
             <w:vAlign w:val="center"/>
           </w:tcPr>
@@ -1389,7 +1390,6 @@
               <w:top w:val="single" w:sz="4" w:space="0" w:color="000000"/>
               <w:left w:val="single" w:sz="4" w:space="0" w:color="000000"/>
               <w:bottom w:val="single" w:sz="4" w:space="0" w:color="000000"/>
-              <w:right w:val="single" w:sz="4" w:space="0" w:color="000000"/>
             </w:tcBorders>
             <w:vAlign w:val="center"/>
           </w:tcPr>
@@ -1542,7 +1542,6 @@
               <w:top w:val="single" w:sz="4" w:space="0" w:color="000000"/>
               <w:left w:val="single" w:sz="4" w:space="0" w:color="000000"/>
               <w:bottom w:val="single" w:sz="4" w:space="0" w:color="000000"/>
-              <w:right w:val="single" w:sz="4" w:space="0" w:color="000000"/>
             </w:tcBorders>
             <w:vAlign w:val="center"/>
           </w:tcPr>
@@ -1580,7 +1579,6 @@
               <w:top w:val="single" w:sz="4" w:space="0" w:color="000000"/>
               <w:left w:val="single" w:sz="4" w:space="0" w:color="000000"/>
               <w:bottom w:val="single" w:sz="4" w:space="0" w:color="000000"/>
-              <w:right w:val="single" w:sz="4" w:space="0" w:color="000000"/>
             </w:tcBorders>
             <w:vAlign w:val="center"/>
           </w:tcPr>
@@ -1618,7 +1616,6 @@
               <w:top w:val="single" w:sz="4" w:space="0" w:color="000000"/>
               <w:left w:val="single" w:sz="4" w:space="0" w:color="000000"/>
               <w:bottom w:val="single" w:sz="4" w:space="0" w:color="000000"/>
-              <w:right w:val="single" w:sz="4" w:space="0" w:color="000000"/>
             </w:tcBorders>
             <w:vAlign w:val="center"/>
           </w:tcPr>
@@ -1656,7 +1653,6 @@
               <w:top w:val="single" w:sz="4" w:space="0" w:color="000000"/>
               <w:left w:val="single" w:sz="4" w:space="0" w:color="000000"/>
               <w:bottom w:val="single" w:sz="4" w:space="0" w:color="000000"/>
-              <w:right w:val="single" w:sz="4" w:space="0" w:color="000000"/>
             </w:tcBorders>
             <w:vAlign w:val="center"/>
           </w:tcPr>
@@ -1694,7 +1690,6 @@
               <w:top w:val="single" w:sz="4" w:space="0" w:color="000000"/>
               <w:left w:val="single" w:sz="4" w:space="0" w:color="000000"/>
               <w:bottom w:val="single" w:sz="4" w:space="0" w:color="000000"/>
-              <w:right w:val="single" w:sz="4" w:space="0" w:color="000000"/>
             </w:tcBorders>
             <w:vAlign w:val="center"/>
           </w:tcPr>
@@ -1732,7 +1727,6 @@
               <w:top w:val="single" w:sz="4" w:space="0" w:color="000000"/>
               <w:left w:val="single" w:sz="4" w:space="0" w:color="000000"/>
               <w:bottom w:val="single" w:sz="4" w:space="0" w:color="000000"/>
-              <w:right w:val="single" w:sz="4" w:space="0" w:color="000000"/>
             </w:tcBorders>
             <w:vAlign w:val="center"/>
           </w:tcPr>
@@ -1770,7 +1764,6 @@
               <w:top w:val="single" w:sz="4" w:space="0" w:color="000000"/>
               <w:left w:val="single" w:sz="4" w:space="0" w:color="000000"/>
               <w:bottom w:val="single" w:sz="4" w:space="0" w:color="000000"/>
-              <w:right w:val="single" w:sz="4" w:space="0" w:color="000000"/>
             </w:tcBorders>
             <w:vAlign w:val="center"/>
           </w:tcPr>

</xml_diff>